<commit_message>
MWST-Hinweis: nicht MWST-pflichtig (Art. 10 Abs. 2 MWSTG)
- Angebotstabelle: MWST-Zeile ersetzt durch Hinweis-Zeile
  „Nicht MWST-pflichtig gemäss Art. 10 Abs. 2 MWSTG" · „keine MWST"
- Total-Zeile: „TOTAL (OHNE MWST)" statt „TOTAL INKL. MWST"
- Preisfussnote unter der Tabelle: „Ohne MWST – nicht MWST-pflichtig
  (Art. 10 Abs. 2 MWSTG)"
- Sektion 6 Konditionen: Bullet entsprechend angepasst
</commit_message>
<xml_diff>
--- a/templates/Angebot_Master_Vorlage.docx
+++ b/templates/Angebot_Master_Vorlage.docx
@@ -1440,7 +1440,7 @@
                 <w:sz w:val="20"/>
                 <w:szCs w:val="20"/>
               </w:rPr>
-              <w:t xml:space="preserve">Zwischensumme netto</w:t>
+              <w:t xml:space="preserve">Zwischensumme</w:t>
             </w:r>
           </w:p>
         </w:tc>
@@ -1533,7 +1533,7 @@
                 <w:sz w:val="20"/>
                 <w:szCs w:val="20"/>
               </w:rPr>
-              <w:t xml:space="preserve">MWST 8,1 %</w:t>
+              <w:t xml:space="preserve">Nicht MWST-pflichtig gemäss Art. 10 Abs. 2 MWSTG</w:t>
             </w:r>
           </w:p>
         </w:tc>
@@ -1561,7 +1561,7 @@
                 <w:sz w:val="20"/>
                 <w:szCs w:val="20"/>
               </w:rPr>
-              <w:t xml:space="preserve">[0.00]</w:t>
+              <w:t xml:space="preserve">keine MWST</w:t>
             </w:r>
           </w:p>
         </w:tc>
@@ -1633,7 +1633,7 @@
                 <w:sz w:val="22"/>
                 <w:szCs w:val="22"/>
               </w:rPr>
-              <w:t xml:space="preserve">TOTAL INKL. MWST</w:t>
+              <w:t xml:space="preserve">TOTAL (OHNE MWST)</w:t>
             </w:r>
           </w:p>
         </w:tc>
@@ -1696,7 +1696,27 @@
           <w:sz w:val="18"/>
           <w:szCs w:val="18"/>
         </w:rPr>
-        <w:t xml:space="preserve">Alle Beträge in CHF, Preise exkl. MWST; die gesetzliche MWST von 8,1 % ist separat ausgewiesen.</w:t>
+        <w:t xml:space="preserve">Alle Beträge in CHF. </w:t>
+      </w:r>
+      <w:r>
+        <w:rPr>
+          <w:rFonts w:ascii="Calibri" w:cs="Calibri" w:eastAsia="Calibri" w:hAnsi="Calibri"/>
+          <w:b/>
+          <w:bCs/>
+          <w:color w:val="0B2545"/>
+          <w:sz w:val="18"/>
+          <w:szCs w:val="18"/>
+        </w:rPr>
+        <w:t xml:space="preserve">Ohne MWST – nicht MWST-pflichtig </w:t>
+      </w:r>
+      <w:r>
+        <w:rPr>
+          <w:rFonts w:ascii="Calibri" w:cs="Calibri" w:eastAsia="Calibri" w:hAnsi="Calibri"/>
+          <w:color w:val="334155"/>
+          <w:sz w:val="18"/>
+          <w:szCs w:val="18"/>
+        </w:rPr>
+        <w:t xml:space="preserve">(Art. 10 Abs. 2 MWSTG).</w:t>
       </w:r>
     </w:p>
     <w:p>
@@ -2019,7 +2039,7 @@
           <w:sz w:val="20"/>
           <w:szCs w:val="20"/>
         </w:rPr>
-        <w:t xml:space="preserve">Preise exkl. MWST, in CHF. Zahlbar innert 30 Tagen netto nach Schlussrechnung.</w:t>
+        <w:t xml:space="preserve">Preise in CHF. Ohne MWST – nicht MWST-pflichtig (Art. 10 Abs. 2 MWSTG). Zahlbar innert 30 Tagen netto nach Schlussrechnung.</w:t>
       </w:r>
     </w:p>
     <w:p>

</xml_diff>

<commit_message>
Marke umgestellt auf kabuu — Netzqualität & EMV Messungen · Engineering
- Offizielles kabuu-Logo als neues Header-Asset (kabuu_logo.png +
  Höhen-normalisierte und Mark-only-Varianten)
- Alte platzhalter-Logo-Assets (logo_lockup*, logo_mark*) entfernt
- Kopfzeile zeigt jetzt das kabuu-Lockup; Fusszeile, Absenderzeile und
  Sachbearbeiter-Text im Meta-Kasten auf kabuu-Wording umgestellt
- Signaturblock: Burak Ücöz bleibt Unterzeichner, Rolle als
  kabuu — Netzqualität & EMV Messungen · Engineering ausgewiesen
- README + Doc-Metadaten entsprechend angepasst
</commit_message>
<xml_diff>
--- a/templates/Angebot_Master_Vorlage.docx
+++ b/templates/Angebot_Master_Vorlage.docx
@@ -16,7 +16,7 @@
           <w:sz w:val="14"/>
           <w:szCs w:val="14"/>
         </w:rPr>
-        <w:t xml:space="preserve">Burak Ücöz  ·  Power Quality / EMV  ·  </w:t>
+        <w:t xml:space="preserve">kabuu  ·  Netzqualität &amp; EMV Messungen  ·  Engineering  ·  </w:t>
       </w:r>
       <w:r>
         <w:rPr>
@@ -286,11 +286,11 @@
                 <w:rFonts w:ascii="Calibri" w:cs="Calibri" w:eastAsia="Calibri" w:hAnsi="Calibri"/>
                 <w:b/>
                 <w:bCs/>
-                <w:color w:val="00B8D9"/>
+                <w:color w:val="0B2545"/>
                 <w:sz w:val="16"/>
                 <w:szCs w:val="16"/>
               </w:rPr>
-              <w:t xml:space="preserve">Power Quality / EMV</w:t>
+              <w:t xml:space="preserve">Netzqualität &amp; EMV Messungen</w:t>
             </w:r>
           </w:p>
         </w:tc>
@@ -2133,11 +2133,11 @@
           <w:rFonts w:ascii="Calibri" w:cs="Calibri" w:eastAsia="Calibri" w:hAnsi="Calibri"/>
           <w:b/>
           <w:bCs/>
-          <w:color w:val="00B8D9"/>
+          <w:color w:val="0B2545"/>
           <w:sz w:val="18"/>
           <w:szCs w:val="18"/>
         </w:rPr>
-        <w:t xml:space="preserve">Power Quality / EMV</w:t>
+        <w:t xml:space="preserve">kabuu — Netzqualität &amp; EMV Messungen · Engineering</w:t>
       </w:r>
     </w:p>
     <w:tbl>
@@ -2331,7 +2331,7 @@
         <w:sz w:val="16"/>
         <w:szCs w:val="16"/>
       </w:rPr>
-      <w:t xml:space="preserve">Burak Ücöz  ·  Power Quality / EMV</w:t>
+      <w:t xml:space="preserve">kabuu  ·  Netzqualität &amp; EMV Messungen  ·  Engineering</w:t>
     </w:r>
     <w:r>
       <w:rPr>
@@ -2439,7 +2439,7 @@
     <w:r>
       <w:drawing>
         <wp:inline distT="0" distB="0" distL="0" distR="0">
-          <wp:extent cx="4381500" cy="1095375"/>
+          <wp:extent cx="1809750" cy="1162050"/>
           <wp:effectExtent t="0" r="0" b="0" l="0"/>
           <wp:docPr id="1" name="" descr="" title=""/>
           <wp:cNvGraphicFramePr>
@@ -2464,7 +2464,7 @@
                 <pic:spPr bwMode="auto">
                   <a:xfrm>
                     <a:off x="0" y="0"/>
-                    <a:ext cx="4381500" cy="1095375"/>
+                    <a:ext cx="1809750" cy="1162050"/>
                   </a:xfrm>
                   <a:prstGeom prst="rect">
                     <a:avLst/>

</xml_diff>